<commit_message>
Rebalance manuscript: feature selection proportionate, remove systematic review framing
- Abstract rewritten: covers full landscape (molecular heterogeneity, multi-omics,
  AI/ML, populations, immune, translational, emerging) - no feature selection mention
- Removed all '66,879 papers' and systematic review language
- Discussion restructured: 4 balanced priorities (cohort diversity, population
  representation, methodological improvement, prospective validation)
- Conclusions lead with what multi-omics reveals, not what's wrong with methods
- Feature selection now in 6.8% of paragraphs (one subsection + part of discussion)
- 149-word abstract, 3,460-word main text, 62 references

Co-Authored-By: Claude Opus 4.6 (1M context) <noreply@anthropic.com>
</commit_message>
<xml_diff>
--- a/Ravichandran_MultiOmics_LungCancer_npjPO_2026.docx
+++ b/Ravichandran_MultiOmics_LungCancer_npjPO_2026.docx
@@ -78,7 +78,7 @@
           <w:b w:val="0"/>
           <w:i w:val="0"/>
         </w:rPr>
-        <w:t>Lung cancer remains the leading cause of cancer death worldwide. While multi-omics integration and artificial intelligence promise to transform molecular classification and treatment selection, critical gaps persist. We systematically reviewed 66,879 papers across 12 thematic domains and conducted a focused census of 25 multi-omics integration studies in lung cancer. We identify a fundamental methodological divide: 72% of studies use the MOVICS framework, 88% depend on TCGA data, and the majority employ survival-based feature selection that collapses biological heterogeneity into binary risk categories. Sex-stratified and never-smoker-focused multi-omics analyses are virtually absent. No study integrates clinical features as competing inputs alongside molecular data. Zero studies are prospective, and zero have produced companion diagnostics. We propose a hierarchical framework that preserves biological taxonomy while enabling clinical risk stratification, and outline priorities for closing these translational gaps.</w:t>
+        <w:t>Lung cancer remains the leading cause of cancer death worldwide. Multi-omics integration and artificial intelligence have advanced molecular classification, yet critical gaps prevent clinical translation. Current subtype classifications fail to capture the heterogeneity of non-small cell lung cancer, particularly in never-smokers and women, who exhibit distinct mutational landscapes and remain underrepresented in genomic studies. While proteogenomic profiling has revealed druggable targets invisible to genomics alone, and deep learning models can predict molecular alterations from histopathology, these advances have not reached clinical practice. Key barriers include reliance on single-cohort retrospective data, absence of sex-stratified and never-smoker-focused analyses, limited integration of clinical with molecular features, and methodological choices that sacrifice biological resolution for prognostic convenience. Here, we review the current landscape of multi-omics and AI/ML in lung cancer across molecular heterogeneity, integration methods, population stratification, immune biomarkers, translational gaps, and emerging technologies, and propose priorities for achieving clinically actionable precision oncology.</w:t>
       </w:r>
     </w:p>
     <w:p>
@@ -111,7 +111,7 @@
         <w:t>Multi-omics integration methods—including iCluster [8], Similarity Network Fusion (SNF) [9], and consensus frameworks such as MOVICS [18]—promise to capture cross-layer regulatory relationships that no single platform can resolve. Concurrently, artificial intelligence and machine learning approaches have demonstrated remarkable capacity: deep learning models now classify histological subtypes and predict driver mutations directly from hematoxylin and eosin (H&amp;E)-stained slides [10], multimodal architectures fuse histopathology with genomic data to improve prognostic prediction [11], and foundation models pre-trained on millions of pathology images are emerging as general-purpose encoders for diverse downstream tasks [12,13].</w:t>
         <w:br/>
         <w:br/>
-        <w:t>Yet translation has stalled. Reproducibility failures, population bias, and the absence of prospective validation have prevented multi-omics and AI discoveries from reaching clinical practice. In this review, we systematically analyzed 66,879 papers across 12 thematic domains and conducted a focused census of 25 multi-omics integration studies in lung cancer. We identify a critical methodological divide in feature selection philosophy, document pervasive gaps in population representation, and propose a hierarchical framework for integration that preserves biological taxonomy while enabling clinical stratification (Table 1; Fig. 1).</w:t>
+        <w:t>Yet translation has stalled. Reproducibility failures, population bias, and the absence of prospective validation have prevented multi-omics and AI discoveries from reaching clinical practice. In this review, we examine the current state of multi-omics integration and AI/ML across the full spectrum of lung cancer research—from molecular heterogeneity and integration methods to underrepresented populations, immune biomarkers, translational bottlenecks, and emerging technologies. We identify critical gaps in study design and population representation, and outline priorities for achieving clinically actionable precision oncology (Table 1; Fig. 1).</w:t>
       </w:r>
     </w:p>
     <w:p>
@@ -424,19 +424,19 @@
           <w:b w:val="0"/>
           <w:i w:val="0"/>
         </w:rPr>
-        <w:t>The central finding of this review is that multi-omics integration in lung cancer is constrained not by a lack of data or methods, but by a feature selection philosophy that prioritizes prognosis over biology. We propose a hierarchical framework that addresses this limitation through a three-stage pipeline (Fig. 3).</w:t>
+        <w:t>This review identifies several interconnected challenges that must be addressed to realize the promise of multi-omics precision oncology in lung cancer. These span study design, methodology, population representation, and clinical translation.</w:t>
         <w:br/>
         <w:br/>
-        <w:t>Stage 1 applies unsupervised biological clustering using variance-based features (MAD or SD) to discover natural molecular subtypes without imposing a survival prior. This approach preserves biological heterogeneity and allows the identification of subtypes defined by distinct mechanisms rather than by shared outcomes. Stage 2 performs within-subtype clinical risk stratification using multivariate methods—elastic net regularization, WGCNA, or stability selection—that integrate both molecular and clinical features as competing predictors. This design tests whether molecular data adds predictive value beyond established clinical variables, a question that no current multi-omics study addresses. Stage 3 maps each subtype-risk combination to specific therapeutic strategies, including targeted therapy, immunotherapy, and drug repurposing candidates identified through CMap or synthetic lethality screens.</w:t>
+        <w:t>First, the field must diversify beyond TCGA. While TCGA has been invaluable, its dominance (88% of integration studies) introduces population bias, limits the study of treatment-resistant and longitudinal disease, and precludes validation in independent cohorts. The two institutional cohort studies in our census demonstrate that prospectively collected, outcome-annotated multi-omics data can reveal clinically relevant subtypes that TCGA re-analysis cannot capture. More such cohorts—particularly in East Asian, African, and Latin American populations—are urgently needed.</w:t>
         <w:br/>
         <w:br/>
-        <w:t>Several methodological improvements are immediately actionable. Feature selection should shift from univariate Cox filtering to multivariate approaches: elastic net simultaneously selects and regularizes features across omics layers, WGCNA identifies co-expressed gene modules that correspond to biological pathways rather than individual genes, and stability selection provides frequency-based confidence in selected features. MethylMix can distinguish driver methylation events from passenger noise, a critical capability given that most CpG sites are biologically inert. DIABLO, which has demonstrated strong performance in breast cancer multi-omics biomarker discovery, should be systematically evaluated in lung cancer.</w:t>
+        <w:t>Second, population representation requires structural change. Sex-stratified analysis should be a default reporting requirement, not an afterthought. Dedicated never-smoker cohorts with paired multi-omics profiling are needed to characterize the biology of a disease that affects 10–25% of patients globally. The exposome-to-subtype intersection—connecting PM2.5, radon, and other exposures to specific molecular subtypes—remains unmapped.</w:t>
         <w:br/>
         <w:br/>
-        <w:t>Population representation requires structural change. Multi-ethnic cohorts that include adequate representation of East Asian, African, and Latin American populations must become standard rather than exceptional. Sex-stratified analysis should be a default reporting requirement, not an afterthought. Dedicated never-smoker cohorts with paired multi-omics profiling are needed to characterize the biology of a disease that affects a growing population worldwide.</w:t>
+        <w:t>Third, methodological choices in multi-omics integration deserve greater scrutiny. The dominant approach of survival-based feature selection, while clinically intuitive, collapses biological heterogeneity into binary risk categories. A hierarchical framework—biological clustering first to discover natural subtypes, then within-subtype risk stratification integrating both molecular and clinical features—would preserve the mechanistic resolution needed for precision therapy (Fig. 3). Multivariate feature selection methods, including elastic net, WGCNA, and stability selection, should replace univariate approaches. Clinical variables should be incorporated as competing predictors rather than excluded from integration models.</w:t>
         <w:br/>
         <w:br/>
-        <w:t>Most critically, the field must move beyond retrospective TCGA re-analysis. Zero multi-omics integration studies in lung cancer are prospective. Zero have produced companion diagnostics approved for clinical use. The path forward requires prospective multi-omics trials that embed integration analysis within clinical decision-making, cost-effectiveness evidence that justifies multi-platform testing, and regulatory engagement to define companion diagnostic pathways for multi-omics classifiers (Fig. 3).</w:t>
+        <w:t>Finally, prospective validation is the critical bottleneck. No multi-omics integration study in lung cancer is prospective. None has produced a companion diagnostic. The path forward requires trials that embed multi-omics integration within clinical decision-making, cost-effectiveness evidence to justify multi-platform testing, and regulatory engagement to define approval pathways for multi-omics classifiers (Fig. 4).</w:t>
       </w:r>
     </w:p>
     <w:p>
@@ -455,10 +455,10 @@
           <w:b w:val="0"/>
           <w:i w:val="0"/>
         </w:rPr>
-        <w:t>Multi-omics integration and artificial intelligence have revealed layers of biological complexity in lung cancer that are invisible to any single molecular platform. Yet our census of 25 integration studies exposes systematic limitations: 72% rely on the MOVICS framework, 88% depend on TCGA data, and the dominant feature selection strategy—survival-based Cox filtering—collapses biological heterogeneity into binary risk categories that cannot guide precision therapy. Sex-stratified and never-smoker-focused analyses are virtually absent. Clinical features are excluded from integration models. The 76 retractions concentrated in epigenetic prognostic signatures signal a broader validation crisis.</w:t>
+        <w:t>Multi-omics integration and AI/ML have revealed layers of biological complexity in lung cancer that are invisible to any single molecular platform. Proteogenomic studies have identified druggable targets that genomics alone would miss. Deep learning models decode molecular information from tissue morphology. Single-cell and spatial technologies map tumor ecosystems at unprecedented resolution. Yet the translation of these discoveries into clinical benefit has been constrained by reliance on retrospective, single-cohort data; the systematic exclusion of never-smokers, women, and non-European populations; and the absence of prospective validation.</w:t>
         <w:br/>
         <w:br/>
-        <w:t>Closing these gaps requires a shift in both methodology and study design. Hierarchical integration that separates biological discovery from clinical risk stratification, multivariate feature selection that tests molecular against clinical predictors, population-specific cohorts that include never-smokers and diverse ancestries, and prospective validation trials that connect multi-omics subtypes to therapeutic decisions—these are the priorities that will determine whether the promise of multi-omics precision oncology is realized in lung cancer.</w:t>
+        <w:t>Closing these gaps requires coordinated action across multiple fronts: diversifying cohorts beyond TCGA, embedding sex-stratified and ancestry-inclusive analysis as standard practice, integrating clinical alongside molecular features in computational models, and advancing from retrospective subtype discovery to prospective trials that connect multi-omics classifications with therapeutic decisions. The tools exist. The data are accumulating. What remains is the will to apply them equitably and validate them rigorously—for all lung cancer patients, including those who have been most consistently overlooked.</w:t>
       </w:r>
     </w:p>
     <w:p>
@@ -5075,7 +5075,7 @@
           <w:b w:val="0"/>
           <w:i w:val="0"/>
         </w:rPr>
-        <w:t>V.R. conceived the study, conducted the systematic literature search and census of multi-omics integration studies, and wrote the manuscript. S.R. supervised the project and critically revised the manuscript. All authors approved the final version.</w:t>
+        <w:t>V.R. conceived the study, performed the literature review and analysis of multi-omics integration studies, and wrote the manuscript. S.R. supervised the project and critically revised the manuscript. All authors approved the final version.</w:t>
       </w:r>
     </w:p>
     <w:p>

</xml_diff>